<commit_message>
Xong buoi  5 cua GIT hoc ve file .iniignore
</commit_message>
<xml_diff>
--- a/BUỔI 5.docx
+++ b/BUỔI 5.docx
@@ -3,38 +3,1181 @@
 <w:document xmlns:wpc="http://schemas.microsoft.com/office/word/2010/wordprocessingCanvas" xmlns:cx="http://schemas.microsoft.com/office/drawing/2014/chartex" xmlns:cx1="http://schemas.microsoft.com/office/drawing/2015/9/8/chartex" xmlns:cx2="http://schemas.microsoft.com/office/drawing/2015/10/21/chartex" xmlns:cx3="http://schemas.microsoft.com/office/drawing/2016/5/9/chartex" xmlns:cx4="http://schemas.microsoft.com/office/drawing/2016/5/10/chartex" xmlns:cx5="http://schemas.microsoft.com/office/drawing/2016/5/11/chartex" xmlns:cx6="http://schemas.microsoft.com/office/drawing/2016/5/12/chartex" xmlns:cx7="http://schemas.microsoft.com/office/drawing/2016/5/13/chartex" xmlns:cx8="http://schemas.microsoft.com/office/drawing/2016/5/14/chartex" xmlns:mc="http://schemas.openxmlformats.org/markup-compatibility/2006" xmlns:aink="http://schemas.microsoft.com/office/drawing/2016/ink" xmlns:am3d="http://schemas.microsoft.com/office/drawing/2017/model3d" xmlns:o="urn:schemas-microsoft-com:office:office" xmlns:oel="http://schemas.microsoft.com/office/2019/extlst" xmlns:r="http://schemas.openxmlformats.org/officeDocument/2006/relationships" xmlns:m="http://schemas.openxmlformats.org/officeDocument/2006/math" xmlns:v="urn:schemas-microsoft-com:vml" xmlns:wp14="http://schemas.microsoft.com/office/word/2010/wordprocessingDrawing" xmlns:wp="http://schemas.openxmlformats.org/drawingml/2006/wordprocessingDrawing" xmlns:w10="urn:schemas-microsoft-com:office:word" xmlns:w="http://schemas.openxmlformats.org/wordprocessingml/2006/main" xmlns:w14="http://schemas.microsoft.com/office/word/2010/wordml" xmlns:w15="http://schemas.microsoft.com/office/word/2012/wordml" xmlns:w16cex="http://schemas.microsoft.com/office/word/2018/wordml/cex" xmlns:w16cid="http://schemas.microsoft.com/office/word/2016/wordml/cid" xmlns:w16="http://schemas.microsoft.com/office/word/2018/wordml" xmlns:w16du="http://schemas.microsoft.com/office/word/2023/wordml/word16du" xmlns:w16sdtdh="http://schemas.microsoft.com/office/word/2020/wordml/sdtdatahash" xmlns:w16sdtfl="http://schemas.microsoft.com/office/word/2024/wordml/sdtformatlock" xmlns:w16se="http://schemas.microsoft.com/office/word/2015/wordml/symex" xmlns:wpg="http://schemas.microsoft.com/office/word/2010/wordprocessingGroup" xmlns:wpi="http://schemas.microsoft.com/office/word/2010/wordprocessingInk" xmlns:wne="http://schemas.microsoft.com/office/word/2006/wordml" xmlns:wps="http://schemas.microsoft.com/office/word/2010/wordprocessingShape" mc:Ignorable="w14 w15 w16se w16cid w16 w16cex w16sdtdh w16sdtfl w16du wp14">
   <w:body>
     <w:p>
-      <w:r>
-        <w:t>BUỔI 5</w:t>
-      </w:r>
+      <w:pPr>
+        <w:rPr>
+          <w:b/>
+          <w:bCs/>
+        </w:rPr>
+      </w:pPr>
+      <w:proofErr w:type="spellStart"/>
+      <w:r>
+        <w:rPr>
+          <w:b/>
+          <w:bCs/>
+        </w:rPr>
+        <w:t>Buổi</w:t>
+      </w:r>
+      <w:proofErr w:type="spellEnd"/>
+      <w:r>
+        <w:rPr>
+          <w:b/>
+          <w:bCs/>
+        </w:rPr>
+        <w:t xml:space="preserve"> </w:t>
+      </w:r>
+      <w:proofErr w:type="gramStart"/>
+      <w:r>
+        <w:rPr>
+          <w:b/>
+          <w:bCs/>
+        </w:rPr>
+        <w:t>5 :</w:t>
+      </w:r>
+      <w:proofErr w:type="gramEnd"/>
+      <w:r>
+        <w:rPr>
+          <w:b/>
+          <w:bCs/>
+        </w:rPr>
+        <w:t xml:space="preserve"> </w:t>
+      </w:r>
+      <w:proofErr w:type="spellStart"/>
+      <w:r>
+        <w:rPr>
+          <w:b/>
+          <w:bCs/>
+        </w:rPr>
+        <w:t>Cấu</w:t>
+      </w:r>
+      <w:proofErr w:type="spellEnd"/>
+      <w:r>
+        <w:rPr>
+          <w:b/>
+          <w:bCs/>
+        </w:rPr>
+        <w:t xml:space="preserve"> </w:t>
+      </w:r>
+      <w:proofErr w:type="spellStart"/>
+      <w:r>
+        <w:rPr>
+          <w:b/>
+          <w:bCs/>
+        </w:rPr>
+        <w:t>hình</w:t>
+      </w:r>
+      <w:proofErr w:type="spellEnd"/>
+      <w:r>
+        <w:rPr>
+          <w:b/>
+          <w:bCs/>
+        </w:rPr>
+        <w:t xml:space="preserve"> GITIGNORE </w:t>
+      </w:r>
+      <w:proofErr w:type="spellStart"/>
+      <w:r>
+        <w:rPr>
+          <w:b/>
+          <w:bCs/>
+        </w:rPr>
+        <w:t>để</w:t>
+      </w:r>
+      <w:proofErr w:type="spellEnd"/>
+      <w:r>
+        <w:rPr>
+          <w:b/>
+          <w:bCs/>
+        </w:rPr>
+        <w:t xml:space="preserve"> </w:t>
+      </w:r>
+      <w:proofErr w:type="spellStart"/>
+      <w:r>
+        <w:rPr>
+          <w:b/>
+          <w:bCs/>
+        </w:rPr>
+        <w:t>bỏ</w:t>
+      </w:r>
+      <w:proofErr w:type="spellEnd"/>
+      <w:r>
+        <w:rPr>
+          <w:b/>
+          <w:bCs/>
+        </w:rPr>
+        <w:t xml:space="preserve"> qua </w:t>
+      </w:r>
+      <w:proofErr w:type="spellStart"/>
+      <w:r>
+        <w:rPr>
+          <w:b/>
+          <w:bCs/>
+        </w:rPr>
+        <w:t>các</w:t>
+      </w:r>
+      <w:proofErr w:type="spellEnd"/>
+      <w:r>
+        <w:rPr>
+          <w:b/>
+          <w:bCs/>
+        </w:rPr>
+        <w:t xml:space="preserve"> file </w:t>
+      </w:r>
+      <w:proofErr w:type="spellStart"/>
+      <w:r>
+        <w:rPr>
+          <w:b/>
+          <w:bCs/>
+        </w:rPr>
+        <w:t>không</w:t>
+      </w:r>
+      <w:proofErr w:type="spellEnd"/>
+      <w:r>
+        <w:rPr>
+          <w:b/>
+          <w:bCs/>
+        </w:rPr>
+        <w:t xml:space="preserve"> </w:t>
+      </w:r>
+      <w:proofErr w:type="spellStart"/>
+      <w:r>
+        <w:rPr>
+          <w:b/>
+          <w:bCs/>
+        </w:rPr>
+        <w:t>cần</w:t>
+      </w:r>
+      <w:proofErr w:type="spellEnd"/>
+      <w:r>
+        <w:rPr>
+          <w:b/>
+          <w:bCs/>
+        </w:rPr>
+        <w:t xml:space="preserve"> </w:t>
+      </w:r>
+      <w:proofErr w:type="spellStart"/>
+      <w:r>
+        <w:rPr>
+          <w:b/>
+          <w:bCs/>
+        </w:rPr>
+        <w:t>giám</w:t>
+      </w:r>
+      <w:proofErr w:type="spellEnd"/>
+      <w:r>
+        <w:rPr>
+          <w:b/>
+          <w:bCs/>
+        </w:rPr>
+        <w:t xml:space="preserve"> </w:t>
+      </w:r>
+      <w:proofErr w:type="spellStart"/>
+      <w:r>
+        <w:rPr>
+          <w:b/>
+          <w:bCs/>
+        </w:rPr>
+        <w:t>sát</w:t>
+      </w:r>
+      <w:proofErr w:type="spellEnd"/>
     </w:p>
     <w:p>
-      <w:r>
-        <w:t>Kjashdjhagdasgduyasgdsa</w:t>
-      </w:r>
+      <w:proofErr w:type="gramStart"/>
+      <w:r>
+        <w:t>.</w:t>
+      </w:r>
+      <w:proofErr w:type="spellStart"/>
+      <w:r>
+        <w:t>gitignore</w:t>
+      </w:r>
+      <w:proofErr w:type="spellEnd"/>
+      <w:proofErr w:type="gramEnd"/>
+      <w:r>
+        <w:t xml:space="preserve"> </w:t>
+      </w:r>
+      <w:proofErr w:type="spellStart"/>
+      <w:r>
+        <w:t>là</w:t>
+      </w:r>
+      <w:proofErr w:type="spellEnd"/>
+      <w:r>
+        <w:t xml:space="preserve"> file </w:t>
+      </w:r>
+      <w:proofErr w:type="spellStart"/>
+      <w:r>
+        <w:t>đơn</w:t>
+      </w:r>
+      <w:proofErr w:type="spellEnd"/>
+      <w:r>
+        <w:t xml:space="preserve"> </w:t>
+      </w:r>
+      <w:proofErr w:type="spellStart"/>
+      <w:r>
+        <w:t>giản</w:t>
+      </w:r>
+      <w:proofErr w:type="spellEnd"/>
+      <w:r>
+        <w:t xml:space="preserve"> </w:t>
+      </w:r>
+      <w:proofErr w:type="spellStart"/>
+      <w:r>
+        <w:t>nằm</w:t>
+      </w:r>
+      <w:proofErr w:type="spellEnd"/>
+      <w:r>
+        <w:t xml:space="preserve"> </w:t>
+      </w:r>
+      <w:proofErr w:type="spellStart"/>
+      <w:r>
+        <w:t>trong</w:t>
+      </w:r>
+      <w:proofErr w:type="spellEnd"/>
+      <w:r>
+        <w:t xml:space="preserve"> </w:t>
+      </w:r>
+      <w:proofErr w:type="spellStart"/>
+      <w:r>
+        <w:t>thư</w:t>
+      </w:r>
+      <w:proofErr w:type="spellEnd"/>
+      <w:r>
+        <w:t xml:space="preserve"> </w:t>
+      </w:r>
+      <w:proofErr w:type="spellStart"/>
+      <w:r>
+        <w:t>mục</w:t>
+      </w:r>
+      <w:proofErr w:type="spellEnd"/>
+      <w:r>
+        <w:t xml:space="preserve"> </w:t>
+      </w:r>
+      <w:proofErr w:type="spellStart"/>
+      <w:r>
+        <w:t>gốc</w:t>
+      </w:r>
+      <w:proofErr w:type="spellEnd"/>
+      <w:r>
+        <w:t xml:space="preserve"> </w:t>
+      </w:r>
+      <w:proofErr w:type="spellStart"/>
+      <w:r>
+        <w:t>của</w:t>
+      </w:r>
+      <w:proofErr w:type="spellEnd"/>
+      <w:r>
+        <w:t xml:space="preserve"> </w:t>
+      </w:r>
+      <w:proofErr w:type="spellStart"/>
+      <w:r>
+        <w:t>dự</w:t>
+      </w:r>
+      <w:proofErr w:type="spellEnd"/>
+      <w:r>
+        <w:t xml:space="preserve"> </w:t>
+      </w:r>
+      <w:proofErr w:type="spellStart"/>
+      <w:r>
+        <w:t>án</w:t>
+      </w:r>
+      <w:proofErr w:type="spellEnd"/>
+      <w:r>
+        <w:t xml:space="preserve"> Git, </w:t>
+      </w:r>
+      <w:proofErr w:type="spellStart"/>
+      <w:r>
+        <w:t>dùng</w:t>
+      </w:r>
+      <w:proofErr w:type="spellEnd"/>
+      <w:r>
+        <w:t xml:space="preserve"> </w:t>
+      </w:r>
+      <w:proofErr w:type="spellStart"/>
+      <w:r>
+        <w:t>để</w:t>
+      </w:r>
+      <w:proofErr w:type="spellEnd"/>
+      <w:r>
+        <w:t xml:space="preserve"> </w:t>
+      </w:r>
+      <w:proofErr w:type="spellStart"/>
+      <w:r>
+        <w:t>chỉ</w:t>
+      </w:r>
+      <w:proofErr w:type="spellEnd"/>
+      <w:r>
+        <w:t xml:space="preserve"> </w:t>
+      </w:r>
+      <w:proofErr w:type="spellStart"/>
+      <w:r>
+        <w:t>định</w:t>
+      </w:r>
+      <w:proofErr w:type="spellEnd"/>
+      <w:r>
+        <w:t xml:space="preserve"> </w:t>
+      </w:r>
+      <w:proofErr w:type="spellStart"/>
+      <w:r>
+        <w:t>các</w:t>
+      </w:r>
+      <w:proofErr w:type="spellEnd"/>
+      <w:r>
+        <w:t xml:space="preserve"> file </w:t>
+      </w:r>
+      <w:proofErr w:type="spellStart"/>
+      <w:r>
+        <w:t>hoặc</w:t>
+      </w:r>
+      <w:proofErr w:type="spellEnd"/>
+      <w:r>
+        <w:t xml:space="preserve"> </w:t>
+      </w:r>
+      <w:proofErr w:type="spellStart"/>
+      <w:r>
+        <w:t>là</w:t>
+      </w:r>
+      <w:proofErr w:type="spellEnd"/>
+      <w:r>
+        <w:t xml:space="preserve"> folder </w:t>
+      </w:r>
+      <w:proofErr w:type="spellStart"/>
+      <w:r>
+        <w:t>mà</w:t>
+      </w:r>
+      <w:proofErr w:type="spellEnd"/>
+      <w:r>
+        <w:t xml:space="preserve"> </w:t>
+      </w:r>
+      <w:proofErr w:type="spellStart"/>
+      <w:r>
+        <w:t>bạn</w:t>
+      </w:r>
+      <w:proofErr w:type="spellEnd"/>
+      <w:r>
+        <w:t xml:space="preserve"> </w:t>
+      </w:r>
+      <w:proofErr w:type="spellStart"/>
+      <w:r>
+        <w:t>muốn</w:t>
+      </w:r>
+      <w:proofErr w:type="spellEnd"/>
+      <w:r>
+        <w:t xml:space="preserve"> Git </w:t>
+      </w:r>
+      <w:proofErr w:type="spellStart"/>
+      <w:r>
+        <w:t>không</w:t>
+      </w:r>
+      <w:proofErr w:type="spellEnd"/>
+      <w:r>
+        <w:t xml:space="preserve"> </w:t>
+      </w:r>
+      <w:proofErr w:type="spellStart"/>
+      <w:r>
+        <w:t>theo</w:t>
+      </w:r>
+      <w:proofErr w:type="spellEnd"/>
+      <w:r>
+        <w:t xml:space="preserve"> </w:t>
+      </w:r>
+      <w:proofErr w:type="spellStart"/>
+      <w:r>
+        <w:t>dõi</w:t>
+      </w:r>
+      <w:proofErr w:type="spellEnd"/>
     </w:p>
     <w:p>
-      <w:r>
-        <w:t>Ádkjasdguyasdyuasd</w:t>
-      </w:r>
+      <w:proofErr w:type="gramStart"/>
+      <w:r>
+        <w:t>.</w:t>
+      </w:r>
+      <w:proofErr w:type="spellStart"/>
+      <w:r>
+        <w:t>gitignore</w:t>
+      </w:r>
+      <w:proofErr w:type="spellEnd"/>
+      <w:proofErr w:type="gramEnd"/>
     </w:p>
     <w:p>
-      <w:r>
-        <w:t>Ádkasudguyadguasd</w:t>
+      <w:proofErr w:type="spellStart"/>
+      <w:r>
+        <w:t>là</w:t>
+      </w:r>
+      <w:proofErr w:type="spellEnd"/>
+      <w:r>
+        <w:t xml:space="preserve"> </w:t>
+      </w:r>
+      <w:proofErr w:type="spellStart"/>
+      <w:r>
+        <w:t>một</w:t>
+      </w:r>
+      <w:proofErr w:type="spellEnd"/>
+      <w:r>
+        <w:t xml:space="preserve"> </w:t>
+      </w:r>
+      <w:proofErr w:type="spellStart"/>
+      <w:r>
+        <w:t>tệp</w:t>
+      </w:r>
+      <w:proofErr w:type="spellEnd"/>
+      <w:r>
+        <w:t xml:space="preserve"> </w:t>
+      </w:r>
+      <w:proofErr w:type="spellStart"/>
+      <w:r>
+        <w:t>văn</w:t>
+      </w:r>
+      <w:proofErr w:type="spellEnd"/>
+      <w:r>
+        <w:t xml:space="preserve"> </w:t>
+      </w:r>
+      <w:proofErr w:type="spellStart"/>
+      <w:r>
+        <w:t>bản</w:t>
+      </w:r>
+      <w:proofErr w:type="spellEnd"/>
+      <w:r>
+        <w:t xml:space="preserve"> </w:t>
+      </w:r>
+      <w:proofErr w:type="spellStart"/>
+      <w:r>
+        <w:t>đặc</w:t>
+      </w:r>
+      <w:proofErr w:type="spellEnd"/>
+      <w:r>
+        <w:t xml:space="preserve"> </w:t>
+      </w:r>
+      <w:proofErr w:type="spellStart"/>
+      <w:r>
+        <w:t>biệt</w:t>
+      </w:r>
+      <w:proofErr w:type="spellEnd"/>
+      <w:r>
+        <w:t xml:space="preserve"> </w:t>
+      </w:r>
+      <w:proofErr w:type="spellStart"/>
+      <w:r>
+        <w:t>trong</w:t>
+      </w:r>
+      <w:proofErr w:type="spellEnd"/>
+      <w:r>
+        <w:t xml:space="preserve"> Git</w:t>
       </w:r>
     </w:p>
     <w:p>
-      <w:r>
-        <w:t>Ádjasduyasduyas</w:t>
+      <w:proofErr w:type="spellStart"/>
+      <w:r>
+        <w:rPr>
+          <w:b/>
+          <w:bCs/>
+        </w:rPr>
+        <w:t>dùng</w:t>
+      </w:r>
+      <w:proofErr w:type="spellEnd"/>
+      <w:r>
+        <w:rPr>
+          <w:b/>
+          <w:bCs/>
+        </w:rPr>
+        <w:t xml:space="preserve"> </w:t>
+      </w:r>
+      <w:proofErr w:type="spellStart"/>
+      <w:r>
+        <w:rPr>
+          <w:b/>
+          <w:bCs/>
+        </w:rPr>
+        <w:t>để</w:t>
+      </w:r>
+      <w:proofErr w:type="spellEnd"/>
+      <w:r>
+        <w:rPr>
+          <w:b/>
+          <w:bCs/>
+        </w:rPr>
+        <w:t xml:space="preserve"> </w:t>
+      </w:r>
+      <w:proofErr w:type="spellStart"/>
+      <w:r>
+        <w:rPr>
+          <w:b/>
+          <w:bCs/>
+        </w:rPr>
+        <w:t>liệt</w:t>
+      </w:r>
+      <w:proofErr w:type="spellEnd"/>
+      <w:r>
+        <w:rPr>
+          <w:b/>
+          <w:bCs/>
+        </w:rPr>
+        <w:t xml:space="preserve"> </w:t>
+      </w:r>
+      <w:proofErr w:type="spellStart"/>
+      <w:r>
+        <w:rPr>
+          <w:b/>
+          <w:bCs/>
+        </w:rPr>
+        <w:t>kê</w:t>
+      </w:r>
+      <w:proofErr w:type="spellEnd"/>
+      <w:r>
+        <w:rPr>
+          <w:b/>
+          <w:bCs/>
+        </w:rPr>
+        <w:t xml:space="preserve"> </w:t>
+      </w:r>
+      <w:proofErr w:type="spellStart"/>
+      <w:r>
+        <w:rPr>
+          <w:b/>
+          <w:bCs/>
+        </w:rPr>
+        <w:t>các</w:t>
+      </w:r>
+      <w:proofErr w:type="spellEnd"/>
+      <w:r>
+        <w:rPr>
+          <w:b/>
+          <w:bCs/>
+        </w:rPr>
+        <w:t xml:space="preserve"> </w:t>
+      </w:r>
+      <w:proofErr w:type="spellStart"/>
+      <w:r>
+        <w:rPr>
+          <w:b/>
+          <w:bCs/>
+        </w:rPr>
+        <w:t>tệp</w:t>
+      </w:r>
+      <w:proofErr w:type="spellEnd"/>
+      <w:r>
+        <w:rPr>
+          <w:b/>
+          <w:bCs/>
+        </w:rPr>
+        <w:t xml:space="preserve"> tin </w:t>
+      </w:r>
+      <w:proofErr w:type="spellStart"/>
+      <w:r>
+        <w:rPr>
+          <w:b/>
+          <w:bCs/>
+        </w:rPr>
+        <w:t>và</w:t>
+      </w:r>
+      <w:proofErr w:type="spellEnd"/>
+      <w:r>
+        <w:rPr>
+          <w:b/>
+          <w:bCs/>
+        </w:rPr>
+        <w:t xml:space="preserve"> </w:t>
+      </w:r>
+      <w:proofErr w:type="spellStart"/>
+      <w:r>
+        <w:rPr>
+          <w:b/>
+          <w:bCs/>
+        </w:rPr>
+        <w:t>thư</w:t>
+      </w:r>
+      <w:proofErr w:type="spellEnd"/>
+      <w:r>
+        <w:rPr>
+          <w:b/>
+          <w:bCs/>
+        </w:rPr>
+        <w:t xml:space="preserve"> </w:t>
+      </w:r>
+      <w:proofErr w:type="spellStart"/>
+      <w:r>
+        <w:rPr>
+          <w:b/>
+          <w:bCs/>
+        </w:rPr>
+        <w:t>mục</w:t>
+      </w:r>
+      <w:proofErr w:type="spellEnd"/>
+      <w:r>
+        <w:rPr>
+          <w:b/>
+          <w:bCs/>
+        </w:rPr>
+        <w:t xml:space="preserve"> </w:t>
+      </w:r>
+      <w:proofErr w:type="spellStart"/>
+      <w:r>
+        <w:rPr>
+          <w:b/>
+          <w:bCs/>
+        </w:rPr>
+        <w:t>mà</w:t>
+      </w:r>
+      <w:proofErr w:type="spellEnd"/>
+      <w:r>
+        <w:rPr>
+          <w:b/>
+          <w:bCs/>
+        </w:rPr>
+        <w:t xml:space="preserve"> </w:t>
+      </w:r>
+      <w:proofErr w:type="spellStart"/>
+      <w:r>
+        <w:rPr>
+          <w:b/>
+          <w:bCs/>
+        </w:rPr>
+        <w:t>bạn</w:t>
+      </w:r>
+      <w:proofErr w:type="spellEnd"/>
+      <w:r>
+        <w:rPr>
+          <w:b/>
+          <w:bCs/>
+        </w:rPr>
+        <w:t xml:space="preserve"> </w:t>
+      </w:r>
+      <w:proofErr w:type="spellStart"/>
+      <w:r>
+        <w:rPr>
+          <w:b/>
+          <w:bCs/>
+        </w:rPr>
+        <w:t>muốn</w:t>
+      </w:r>
+      <w:proofErr w:type="spellEnd"/>
+      <w:r>
+        <w:rPr>
+          <w:b/>
+          <w:bCs/>
+        </w:rPr>
+        <w:t xml:space="preserve"> Git </w:t>
+      </w:r>
+      <w:proofErr w:type="spellStart"/>
+      <w:r>
+        <w:rPr>
+          <w:b/>
+          <w:bCs/>
+        </w:rPr>
+        <w:t>bỏ</w:t>
+      </w:r>
+      <w:proofErr w:type="spellEnd"/>
+      <w:r>
+        <w:rPr>
+          <w:b/>
+          <w:bCs/>
+        </w:rPr>
+        <w:t xml:space="preserve"> qua, </w:t>
+      </w:r>
+      <w:proofErr w:type="spellStart"/>
+      <w:r>
+        <w:rPr>
+          <w:b/>
+          <w:bCs/>
+        </w:rPr>
+        <w:t>không</w:t>
+      </w:r>
+      <w:proofErr w:type="spellEnd"/>
+      <w:r>
+        <w:rPr>
+          <w:b/>
+          <w:bCs/>
+        </w:rPr>
+        <w:t xml:space="preserve"> </w:t>
+      </w:r>
+      <w:proofErr w:type="spellStart"/>
+      <w:r>
+        <w:rPr>
+          <w:b/>
+          <w:bCs/>
+        </w:rPr>
+        <w:t>theo</w:t>
+      </w:r>
+      <w:proofErr w:type="spellEnd"/>
+      <w:r>
+        <w:rPr>
+          <w:b/>
+          <w:bCs/>
+        </w:rPr>
+        <w:t xml:space="preserve"> </w:t>
+      </w:r>
+      <w:proofErr w:type="spellStart"/>
+      <w:r>
+        <w:rPr>
+          <w:b/>
+          <w:bCs/>
+        </w:rPr>
+        <w:t>dõi</w:t>
+      </w:r>
+      <w:proofErr w:type="spellEnd"/>
+      <w:r>
+        <w:rPr>
+          <w:b/>
+          <w:bCs/>
+        </w:rPr>
+        <w:t xml:space="preserve"> (track) </w:t>
+      </w:r>
+      <w:proofErr w:type="spellStart"/>
+      <w:r>
+        <w:rPr>
+          <w:b/>
+          <w:bCs/>
+        </w:rPr>
+        <w:t>hoặc</w:t>
+      </w:r>
+      <w:proofErr w:type="spellEnd"/>
+      <w:r>
+        <w:rPr>
+          <w:b/>
+          <w:bCs/>
+        </w:rPr>
+        <w:t xml:space="preserve"> </w:t>
+      </w:r>
+      <w:proofErr w:type="spellStart"/>
+      <w:r>
+        <w:rPr>
+          <w:b/>
+          <w:bCs/>
+        </w:rPr>
+        <w:t>đưa</w:t>
+      </w:r>
+      <w:proofErr w:type="spellEnd"/>
+      <w:r>
+        <w:rPr>
+          <w:b/>
+          <w:bCs/>
+        </w:rPr>
+        <w:t xml:space="preserve"> </w:t>
+      </w:r>
+      <w:proofErr w:type="spellStart"/>
+      <w:r>
+        <w:rPr>
+          <w:b/>
+          <w:bCs/>
+        </w:rPr>
+        <w:t>vào</w:t>
+      </w:r>
+      <w:proofErr w:type="spellEnd"/>
+      <w:r>
+        <w:rPr>
+          <w:b/>
+          <w:bCs/>
+        </w:rPr>
+        <w:t xml:space="preserve"> commit</w:t>
       </w:r>
     </w:p>
     <w:p>
       <w:r>
-        <w:t>Ádausyduyaduas</w:t>
-      </w:r>
+        <w:t xml:space="preserve">. </w:t>
+      </w:r>
+      <w:proofErr w:type="spellStart"/>
+      <w:r>
+        <w:t>Nó</w:t>
+      </w:r>
+      <w:proofErr w:type="spellEnd"/>
+      <w:r>
+        <w:t xml:space="preserve"> </w:t>
+      </w:r>
+      <w:proofErr w:type="spellStart"/>
+      <w:r>
+        <w:t>giúp</w:t>
+      </w:r>
+      <w:proofErr w:type="spellEnd"/>
+      <w:r>
+        <w:t xml:space="preserve"> </w:t>
+      </w:r>
+      <w:proofErr w:type="spellStart"/>
+      <w:r>
+        <w:t>giữ</w:t>
+      </w:r>
+      <w:proofErr w:type="spellEnd"/>
+      <w:r>
+        <w:t xml:space="preserve"> </w:t>
+      </w:r>
+      <w:proofErr w:type="spellStart"/>
+      <w:r>
+        <w:t>kho</w:t>
+      </w:r>
+      <w:proofErr w:type="spellEnd"/>
+      <w:r>
+        <w:t xml:space="preserve"> </w:t>
+      </w:r>
+      <w:proofErr w:type="spellStart"/>
+      <w:r>
+        <w:t>lưu</w:t>
+      </w:r>
+      <w:proofErr w:type="spellEnd"/>
+      <w:r>
+        <w:t xml:space="preserve"> </w:t>
+      </w:r>
+      <w:proofErr w:type="spellStart"/>
+      <w:r>
+        <w:t>trữ</w:t>
+      </w:r>
+      <w:proofErr w:type="spellEnd"/>
+      <w:r>
+        <w:t xml:space="preserve"> (repository) </w:t>
+      </w:r>
+      <w:proofErr w:type="spellStart"/>
+      <w:r>
+        <w:t>gọn</w:t>
+      </w:r>
+      <w:proofErr w:type="spellEnd"/>
+      <w:r>
+        <w:t xml:space="preserve"> </w:t>
+      </w:r>
+      <w:proofErr w:type="spellStart"/>
+      <w:r>
+        <w:t>gàng</w:t>
+      </w:r>
+      <w:proofErr w:type="spellEnd"/>
+      <w:r>
+        <w:t xml:space="preserve">, </w:t>
+      </w:r>
+      <w:proofErr w:type="spellStart"/>
+      <w:r>
+        <w:t>tránh</w:t>
+      </w:r>
+      <w:proofErr w:type="spellEnd"/>
+      <w:r>
+        <w:t xml:space="preserve"> push </w:t>
+      </w:r>
+      <w:proofErr w:type="spellStart"/>
+      <w:r>
+        <w:t>các</w:t>
+      </w:r>
+      <w:proofErr w:type="spellEnd"/>
+      <w:r>
+        <w:t xml:space="preserve"> file </w:t>
+      </w:r>
+      <w:proofErr w:type="spellStart"/>
+      <w:r>
+        <w:t>nhạy</w:t>
+      </w:r>
+      <w:proofErr w:type="spellEnd"/>
+      <w:r>
+        <w:t xml:space="preserve"> </w:t>
+      </w:r>
+      <w:proofErr w:type="spellStart"/>
+      <w:r>
+        <w:t>cảm</w:t>
+      </w:r>
+      <w:proofErr w:type="spellEnd"/>
+      <w:r>
+        <w:t xml:space="preserve"> (</w:t>
+      </w:r>
+      <w:proofErr w:type="spellStart"/>
+      <w:r>
+        <w:t>như</w:t>
+      </w:r>
+      <w:proofErr w:type="spellEnd"/>
     </w:p>
     <w:p>
-      <w:r>
-        <w:t>íad</w:t>
+      <w:proofErr w:type="gramStart"/>
+      <w:r>
+        <w:t>.env</w:t>
+      </w:r>
+      <w:proofErr w:type="gramEnd"/>
+    </w:p>
+    <w:p>
+      <w:r>
+        <w:t xml:space="preserve">, </w:t>
+      </w:r>
+      <w:proofErr w:type="spellStart"/>
+      <w:r>
+        <w:t>mật</w:t>
+      </w:r>
+      <w:proofErr w:type="spellEnd"/>
+      <w:r>
+        <w:t xml:space="preserve"> </w:t>
+      </w:r>
+      <w:proofErr w:type="spellStart"/>
+      <w:r>
+        <w:t>khẩu</w:t>
+      </w:r>
+      <w:proofErr w:type="spellEnd"/>
+      <w:r>
+        <w:t xml:space="preserve">) </w:t>
+      </w:r>
+      <w:proofErr w:type="spellStart"/>
+      <w:r>
+        <w:t>hoặc</w:t>
+      </w:r>
+      <w:proofErr w:type="spellEnd"/>
+      <w:r>
+        <w:t xml:space="preserve"> file </w:t>
+      </w:r>
+      <w:proofErr w:type="spellStart"/>
+      <w:r>
+        <w:t>tạm</w:t>
+      </w:r>
+      <w:proofErr w:type="spellEnd"/>
+      <w:r>
+        <w:t>, file build (</w:t>
+      </w:r>
+    </w:p>
+    <w:p>
+      <w:proofErr w:type="spellStart"/>
+      <w:r>
+        <w:t>node_modules</w:t>
+      </w:r>
+      <w:proofErr w:type="spellEnd"/>
+      <w:r>
+        <w:t>/</w:t>
+      </w:r>
+    </w:p>
+    <w:p>
+      <w:r>
+        <w:t>,</w:t>
+      </w:r>
+    </w:p>
+    <w:p>
+      <w:proofErr w:type="spellStart"/>
+      <w:r>
+        <w:t>dist</w:t>
+      </w:r>
+      <w:proofErr w:type="spellEnd"/>
+      <w:r>
+        <w:t>/</w:t>
+      </w:r>
+    </w:p>
+    <w:p>
+      <w:r>
+        <w:t xml:space="preserve">) </w:t>
+      </w:r>
+      <w:proofErr w:type="spellStart"/>
+      <w:r>
+        <w:t>lên</w:t>
+      </w:r>
+      <w:proofErr w:type="spellEnd"/>
+      <w:r>
+        <w:t xml:space="preserve"> </w:t>
+      </w:r>
+      <w:proofErr w:type="spellStart"/>
+      <w:r>
+        <w:t>kho</w:t>
+      </w:r>
+      <w:proofErr w:type="spellEnd"/>
+      <w:r>
+        <w:t xml:space="preserve"> </w:t>
+      </w:r>
+      <w:proofErr w:type="spellStart"/>
+      <w:r>
+        <w:t>lưu</w:t>
+      </w:r>
+      <w:proofErr w:type="spellEnd"/>
+      <w:r>
+        <w:t xml:space="preserve"> </w:t>
+      </w:r>
+      <w:proofErr w:type="spellStart"/>
+      <w:r>
+        <w:t>trữ</w:t>
+      </w:r>
+      <w:proofErr w:type="spellEnd"/>
+      <w:r>
+        <w:t xml:space="preserve"> </w:t>
+      </w:r>
+      <w:proofErr w:type="spellStart"/>
+      <w:r>
+        <w:t>dùng</w:t>
+      </w:r>
+      <w:proofErr w:type="spellEnd"/>
+      <w:r>
+        <w:t xml:space="preserve"> </w:t>
+      </w:r>
+      <w:proofErr w:type="spellStart"/>
+      <w:r>
+        <w:t>chung</w:t>
+      </w:r>
+      <w:proofErr w:type="spellEnd"/>
+      <w:r>
+        <w:t>.</w:t>
+      </w:r>
+    </w:p>
+    <w:p>
+      <w:hyperlink r:id="rId4" w:history="1">
+        <w:r>
+          <w:rPr>
+            <w:rStyle w:val="Hyperlink"/>
+          </w:rPr>
+          <w:t>200Lab</w:t>
+        </w:r>
+      </w:hyperlink>
+    </w:p>
+    <w:p>
+      <w:proofErr w:type="spellStart"/>
+      <w:r>
+        <w:t>Muốn</w:t>
+      </w:r>
+      <w:proofErr w:type="spellEnd"/>
+      <w:r>
+        <w:t xml:space="preserve"> </w:t>
+      </w:r>
+      <w:proofErr w:type="spellStart"/>
+      <w:r>
+        <w:t>đưa</w:t>
+      </w:r>
+      <w:proofErr w:type="spellEnd"/>
+      <w:r>
+        <w:t xml:space="preserve"> </w:t>
+      </w:r>
+      <w:proofErr w:type="spellStart"/>
+      <w:r>
+        <w:t>những</w:t>
+      </w:r>
+      <w:proofErr w:type="spellEnd"/>
+      <w:r>
+        <w:t xml:space="preserve"> </w:t>
+      </w:r>
+      <w:proofErr w:type="spellStart"/>
+      <w:r>
+        <w:t>thư</w:t>
+      </w:r>
+      <w:proofErr w:type="spellEnd"/>
+      <w:r>
+        <w:t xml:space="preserve"> </w:t>
+      </w:r>
+      <w:proofErr w:type="spellStart"/>
+      <w:r>
+        <w:t>mục</w:t>
+      </w:r>
+      <w:proofErr w:type="spellEnd"/>
+      <w:r>
+        <w:t xml:space="preserve"> hay file </w:t>
+      </w:r>
+      <w:proofErr w:type="spellStart"/>
+      <w:proofErr w:type="gramStart"/>
+      <w:r>
+        <w:t>vào</w:t>
+      </w:r>
+      <w:proofErr w:type="spellEnd"/>
+      <w:r>
+        <w:t xml:space="preserve"> .</w:t>
+      </w:r>
+      <w:proofErr w:type="spellStart"/>
+      <w:r>
+        <w:t>gitignore</w:t>
+      </w:r>
+      <w:proofErr w:type="spellEnd"/>
+      <w:proofErr w:type="gramEnd"/>
+      <w:r>
+        <w:t xml:space="preserve"> </w:t>
+      </w:r>
+      <w:proofErr w:type="spellStart"/>
+      <w:r>
+        <w:t>thì</w:t>
+      </w:r>
+      <w:proofErr w:type="spellEnd"/>
+    </w:p>
+    <w:p>
+      <w:r>
+        <mc:AlternateContent>
+          <mc:Choice Requires="wps">
+            <w:drawing>
+              <wp:inline distT="0" distB="0" distL="0" distR="0" wp14:anchorId="355ED2D7" wp14:editId="4A3C5A95">
+                <wp:extent cx="304800" cy="304800"/>
+                <wp:effectExtent l="0" t="0" r="0" b="0"/>
+                <wp:docPr id="916861199" name="Rectangle 2"/>
+                <wp:cNvGraphicFramePr>
+                  <a:graphicFrameLocks xmlns:a="http://schemas.openxmlformats.org/drawingml/2006/main" noChangeAspect="1"/>
+                </wp:cNvGraphicFramePr>
+                <a:graphic xmlns:a="http://schemas.openxmlformats.org/drawingml/2006/main">
+                  <a:graphicData uri="http://schemas.microsoft.com/office/word/2010/wordprocessingShape">
+                    <wps:wsp>
+                      <wps:cNvSpPr>
+                        <a:spLocks noChangeAspect="1" noChangeArrowheads="1"/>
+                      </wps:cNvSpPr>
+                      <wps:spPr bwMode="auto">
+                        <a:xfrm>
+                          <a:off x="0" y="0"/>
+                          <a:ext cx="304800" cy="304800"/>
+                        </a:xfrm>
+                        <a:prstGeom prst="rect">
+                          <a:avLst/>
+                        </a:prstGeom>
+                        <a:noFill/>
+                        <a:ln>
+                          <a:noFill/>
+                        </a:ln>
+                        <a:extLst>
+                          <a:ext uri="{909E8E84-426E-40DD-AFC4-6F175D3DCCD1}">
+                            <a14:hiddenFill xmlns:a14="http://schemas.microsoft.com/office/drawing/2010/main">
+                              <a:solidFill>
+                                <a:srgbClr val="FFFFFF"/>
+                              </a:solidFill>
+                            </a14:hiddenFill>
+                          </a:ext>
+                          <a:ext uri="{91240B29-F687-4F45-9708-019B960494DF}">
+                            <a14:hiddenLine xmlns:a14="http://schemas.microsoft.com/office/drawing/2010/main" w="9525">
+                              <a:solidFill>
+                                <a:srgbClr val="000000"/>
+                              </a:solidFill>
+                              <a:miter lim="800000"/>
+                              <a:headEnd/>
+                              <a:tailEnd/>
+                            </a14:hiddenLine>
+                          </a:ext>
+                        </a:extLst>
+                      </wps:spPr>
+                      <wps:bodyPr rot="0" vert="horz" wrap="square" lIns="91440" tIns="45720" rIns="91440" bIns="45720" anchor="t" anchorCtr="0" upright="1">
+                        <a:noAutofit/>
+                      </wps:bodyPr>
+                    </wps:wsp>
+                  </a:graphicData>
+                </a:graphic>
+              </wp:inline>
+            </w:drawing>
+          </mc:Choice>
+          <mc:Fallback>
+            <w:pict>
+              <v:rect w14:anchorId="037E2F2C" id="Rectangle 2" o:spid="_x0000_s1026" style="width:24pt;height:24pt;visibility:visible;mso-wrap-style:square;mso-left-percent:-10001;mso-top-percent:-10001;mso-position-horizontal:absolute;mso-position-horizontal-relative:char;mso-position-vertical:absolute;mso-position-vertical-relative:line;mso-left-percent:-10001;mso-top-percent:-10001;v-text-anchor:top" o:gfxdata="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" filled="f" stroked="f">
+                <o:lock v:ext="edit" aspectratio="t"/>
+                <w10:anchorlock/>
+              </v:rect>
+            </w:pict>
+          </mc:Fallback>
+        </mc:AlternateContent>
+      </w:r>
+    </w:p>
+    <w:p>
+      <w:r>
+        <w:lastRenderedPageBreak/>
+        <w:drawing>
+          <wp:inline distT="0" distB="0" distL="0" distR="0" wp14:anchorId="1601EC3A" wp14:editId="329F7EC6">
+            <wp:extent cx="5943600" cy="3359150"/>
+            <wp:effectExtent l="0" t="0" r="0" b="0"/>
+            <wp:docPr id="1137960394" name="Picture 1"/>
+            <wp:cNvGraphicFramePr>
+              <a:graphicFrameLocks xmlns:a="http://schemas.openxmlformats.org/drawingml/2006/main" noChangeAspect="1"/>
+            </wp:cNvGraphicFramePr>
+            <a:graphic xmlns:a="http://schemas.openxmlformats.org/drawingml/2006/main">
+              <a:graphicData uri="http://schemas.openxmlformats.org/drawingml/2006/picture">
+                <pic:pic xmlns:pic="http://schemas.openxmlformats.org/drawingml/2006/picture">
+                  <pic:nvPicPr>
+                    <pic:cNvPr id="1137960394" name=""/>
+                    <pic:cNvPicPr/>
+                  </pic:nvPicPr>
+                  <pic:blipFill>
+                    <a:blip r:embed="rId5"/>
+                    <a:stretch>
+                      <a:fillRect/>
+                    </a:stretch>
+                  </pic:blipFill>
+                  <pic:spPr>
+                    <a:xfrm>
+                      <a:off x="0" y="0"/>
+                      <a:ext cx="5943600" cy="3359150"/>
+                    </a:xfrm>
+                    <a:prstGeom prst="rect">
+                      <a:avLst/>
+                    </a:prstGeom>
+                  </pic:spPr>
+                </pic:pic>
+              </a:graphicData>
+            </a:graphic>
+          </wp:inline>
+        </w:drawing>
       </w:r>
     </w:p>
     <w:sectPr>
@@ -650,7 +1793,6 @@
   <w:style w:type="character" w:default="1" w:styleId="DefaultParagraphFont">
     <w:name w:val="Default Paragraph Font"/>
     <w:uiPriority w:val="1"/>
-    <w:semiHidden/>
     <w:unhideWhenUsed/>
   </w:style>
   <w:style w:type="table" w:default="1" w:styleId="TableNormal">
@@ -962,6 +2104,29 @@
       <w:smallCaps/>
       <w:color w:val="2F5496" w:themeColor="accent1" w:themeShade="BF"/>
       <w:spacing w:val="5"/>
+    </w:rPr>
+  </w:style>
+  <w:style w:type="character" w:styleId="Hyperlink">
+    <w:name w:val="Hyperlink"/>
+    <w:basedOn w:val="DefaultParagraphFont"/>
+    <w:uiPriority w:val="99"/>
+    <w:unhideWhenUsed/>
+    <w:rsid w:val="00DA2341"/>
+    <w:rPr>
+      <w:color w:val="0563C1" w:themeColor="hyperlink"/>
+      <w:u w:val="single"/>
+    </w:rPr>
+  </w:style>
+  <w:style w:type="character" w:styleId="UnresolvedMention">
+    <w:name w:val="Unresolved Mention"/>
+    <w:basedOn w:val="DefaultParagraphFont"/>
+    <w:uiPriority w:val="99"/>
+    <w:semiHidden/>
+    <w:unhideWhenUsed/>
+    <w:rsid w:val="00DA2341"/>
+    <w:rPr>
+      <w:color w:val="605E5C"/>
+      <w:shd w:val="clear" w:color="auto" w:fill="E1DFDD"/>
     </w:rPr>
   </w:style>
 </w:styles>

</xml_diff>